<commit_message>
TPEG2: Wordy srovnány s Markdownem (21219-1 až -10, -15, -16)
Markdown v repozitáři měl novější text než Word (odpovídal webu
StandardLand). Text z Markdownu je přenesený do Wordů se zachovaným
formátem; 21219-2, -3, -4 převedeny z .doc na .docx. Wordy 21219-15 a -16
nově v repozitáři.

Opravy v Markdownu: část 18 je TFP (ne PKI) v 21219-1, odstraněná
zatoulaná věta v hlavičce 21219-5 a -6, překlepy v 21219-7 a -9,
odkazy na obrázky v 21219-7 (místo lokálních cest app://).

Co-Authored-By: Claude Opus 5.5 <noreply@anthropic.com>
Claude-Session: https://claude.ai/code/session_013XsG4Ss77xGbwrRyA4pUBh
</commit_message>
<xml_diff>
--- a/extrakty/doc/TC278WG4/extract_21219-10_(2017).docx
+++ b/extrakty/doc/TC278WG4/extract_21219-10_(2017).docx
@@ -412,17 +412,11 @@
       <w:bookmarkEnd w:id="0"/>
       <w:r>
         <w:rPr>
-          <w:rtl w:val="0"/>
-        </w:rPr>
-        <w:tab/>
-      </w:r>
-      <w:r>
-        <w:rPr>
           <w:sz w:val="28"/>
           <w:szCs w:val="28"/>
           <w:rtl w:val="0"/>
         </w:rPr>
-        <w:t xml:space="preserve">Vydána 2016, 10 stran</w:t>
+        <w:t xml:space="preserve">	Vydána 2015, 19 stran</w:t>
       </w:r>
     </w:p>
     <w:p>
@@ -461,255 +455,63 @@
         <w:rPr>
           <w:rtl w:val="0"/>
         </w:rPr>
-        <w:t xml:space="preserve">Technická specifikace ISO 21219 se zabývá druhou generací protokolu TPEG pro </w:t>
-      </w:r>
-      <w:r>
-        <w:rPr>
-          <w:b w:val="1"/>
-          <w:bCs w:val="1"/>
-          <w:rtl w:val="0"/>
-        </w:rPr>
-        <w:t xml:space="preserve">poskytování informací o dopravě koncovým uživatelům</w:t>
-      </w:r>
-      <w:r>
-        <w:rPr>
-          <w:rtl w:val="0"/>
-        </w:rPr>
-        <w:t xml:space="preserve">, označovaným TPEG2. </w:t>
-      </w:r>
-    </w:p>
-    <w:p>
-      <w:pPr>
-        <w:pageBreakBefore w:val="0"/>
-        <w:spacing w:after="120" w:lineRule="auto"/>
-        <w:jc w:val="both"/>
-        <w:rPr/>
-      </w:pPr>
-      <w:r>
-        <w:rPr>
-          <w:rtl w:val="0"/>
-        </w:rPr>
-        <w:t xml:space="preserve">ISO/TS 21219 obsahuje řadu částí, které pokrývají úvod, pravidla, “sady nástrojů” (toolkity) a jednotlivé aplikace. TPEG2 je postaven na modelování v UML, se sadou základních pravidel stanovujících strategii modelování a pravidla konverze modelu do dvou fyzických formátů: binárního pro vysílání v DAB a XML pro šíření Internetem (části 2, 3, 4 normy). Pro snazší udržovatelnost specifikace se změny provádí pouze na úrovni obecného modelu v UML (XMI soubor) a následně pomocí automatizovaných nástrojů převádějí do popisů jednotlivých fyzických formátů (dokument s přílohami pro každý fyzický formát). Tato koncepční témata jsou řešena částmi, které se nazývají sady nástrojů (toolkity).</w:t>
-      </w:r>
-    </w:p>
-    <w:p>
-      <w:pPr>
-        <w:pageBreakBefore w:val="0"/>
-        <w:spacing w:after="120" w:lineRule="auto"/>
-        <w:jc w:val="both"/>
-        <w:rPr/>
-      </w:pPr>
-      <w:r>
-        <w:rPr>
-          <w:rtl w:val="0"/>
-        </w:rPr>
-        <w:t xml:space="preserve">TPEG2 stanovuje použití tří dílčích částí (kontejnerů): management zpráv (část 6 normy), dopravní aplikaci (mnoho částí) a odkazování na polohu (část 7 normy).</w:t>
-      </w:r>
-    </w:p>
-    <w:p>
-      <w:pPr>
-        <w:pageBreakBefore w:val="0"/>
-        <w:spacing w:after="120" w:lineRule="auto"/>
-        <w:jc w:val="both"/>
-        <w:rPr/>
-      </w:pPr>
-      <w:r>
-        <w:rPr>
-          <w:rtl w:val="0"/>
-        </w:rPr>
-        <w:t xml:space="preserve">ISO/TS 21219 se skládá z těchto částí (tučně je zvýrazněna část popisovaná v tomto extraktu):</w:t>
-      </w:r>
-    </w:p>
-    <w:p>
-      <w:pPr>
-        <w:pageBreakBefore w:val="0"/>
-        <w:numPr>
-          <w:ilvl w:val="0"/>
-          <w:numId w:val="1"/>
-        </w:numPr>
-        <w:pBdr>
-          <w:top w:space="0" w:sz="0" w:val="nil"/>
-          <w:left w:space="0" w:sz="0" w:val="nil"/>
-          <w:bottom w:space="0" w:sz="0" w:val="nil"/>
-          <w:right w:space="0" w:sz="0" w:val="nil"/>
-          <w:between w:space="0" w:sz="0" w:val="nil"/>
-        </w:pBdr>
-        <w:spacing w:after="120" w:lineRule="auto"/>
-        <w:ind w:left="284" w:hanging="218"/>
-        <w:jc w:val="both"/>
-        <w:rPr/>
-      </w:pPr>
-      <w:r>
-        <w:rPr>
-          <w:b w:val="1"/>
-          <w:bCs w:val="1"/>
-          <w:rtl w:val="0"/>
-        </w:rPr>
-        <w:t xml:space="preserve">Toolkity </w:t>
-      </w:r>
-      <w:r>
-        <w:rPr>
-          <w:rtl w:val="0"/>
-        </w:rPr>
-        <w:t xml:space="preserve">(nástroje): TPEG2-INV (část 1: Úvod, číslování a verze), TPEG2-UML (část 2: Pravidla modelování pomocí UML), TPEG2-UBCR (část 3: Pravidla pro konverzi z UML do binárního kódu), TPEG2-UXCR (část 4: Pravidla pro konverzi UML do XML), TPEG2-SFW (část 5: Rámec pro služby TPEG), TPEG2-MMC (část 6: Kontejner pro management zpráv), TPEG2-LRC (část 7: Kontejner pro odkazování na polohu)</w:t>
-      </w:r>
-    </w:p>
-    <w:p>
-      <w:pPr>
-        <w:pageBreakBefore w:val="0"/>
-        <w:numPr>
-          <w:ilvl w:val="0"/>
-          <w:numId w:val="1"/>
-        </w:numPr>
-        <w:pBdr>
-          <w:top w:space="0" w:sz="0" w:val="nil"/>
-          <w:left w:space="0" w:sz="0" w:val="nil"/>
-          <w:bottom w:space="0" w:sz="0" w:val="nil"/>
-          <w:right w:space="0" w:sz="0" w:val="nil"/>
-          <w:between w:space="0" w:sz="0" w:val="nil"/>
-        </w:pBdr>
-        <w:spacing w:after="120" w:lineRule="auto"/>
-        <w:ind w:left="284" w:hanging="218"/>
-        <w:jc w:val="both"/>
-        <w:rPr/>
-      </w:pPr>
-      <w:r>
-        <w:rPr>
-          <w:b w:val="1"/>
-          <w:bCs w:val="1"/>
-          <w:rtl w:val="0"/>
-        </w:rPr>
-        <w:t xml:space="preserve">Speciální aplikace</w:t>
-      </w:r>
-      <w:r>
-        <w:rPr>
-          <w:rtl w:val="0"/>
-        </w:rPr>
-        <w:t xml:space="preserve">: TPEG2-SNI (část 9: Informace o službách a síti), </w:t>
-      </w:r>
-      <w:r>
-        <w:rPr>
-          <w:b w:val="1"/>
-          <w:bCs w:val="1"/>
-          <w:rtl w:val="0"/>
-        </w:rPr>
-        <w:t xml:space="preserve">TPEG2-CAI (část 10: Informace o podmíněném přístupu)</w:t>
-      </w:r>
-      <w:r>
-        <w:rPr>
-          <w:rtl w:val="0"/>
-        </w:rPr>
-        <w:t xml:space="preserve">, TPEG2-LTE (část 24: Slabé šifrování)</w:t>
-      </w:r>
-    </w:p>
-    <w:p>
-      <w:pPr>
-        <w:pageBreakBefore w:val="0"/>
-        <w:numPr>
-          <w:ilvl w:val="0"/>
-          <w:numId w:val="1"/>
-        </w:numPr>
-        <w:pBdr>
-          <w:top w:space="0" w:sz="0" w:val="nil"/>
-          <w:left w:space="0" w:sz="0" w:val="nil"/>
-          <w:bottom w:space="0" w:sz="0" w:val="nil"/>
-          <w:right w:space="0" w:sz="0" w:val="nil"/>
-          <w:between w:space="0" w:sz="0" w:val="nil"/>
-        </w:pBdr>
-        <w:spacing w:after="120" w:lineRule="auto"/>
-        <w:ind w:left="284" w:hanging="218"/>
-        <w:jc w:val="both"/>
-        <w:rPr/>
-      </w:pPr>
-      <w:r>
-        <w:rPr>
-          <w:b w:val="1"/>
-          <w:bCs w:val="1"/>
-          <w:rtl w:val="0"/>
-        </w:rPr>
-        <w:t xml:space="preserve">Odkazování na polohu</w:t>
-      </w:r>
-      <w:r>
-        <w:rPr>
-          <w:rtl w:val="0"/>
-        </w:rPr>
-        <w:t xml:space="preserve">: TPEG2-ULR (část 11: Odkazování na polohu v aplikacích), TPEG2-ETL (část 20: Odkazování na polohu metodou rozšířeného TMC), TPEG2-GLR (část 21: Geografické odkazování na polohu), TPEG2-OLR (část 22: Odkazování na polohu metodou OpenLR)</w:t>
-      </w:r>
-    </w:p>
-    <w:p>
-      <w:pPr>
-        <w:pageBreakBefore w:val="0"/>
-        <w:numPr>
-          <w:ilvl w:val="0"/>
-          <w:numId w:val="1"/>
-        </w:numPr>
-        <w:pBdr>
-          <w:top w:space="0" w:sz="0" w:val="nil"/>
-          <w:left w:space="0" w:sz="0" w:val="nil"/>
-          <w:bottom w:space="0" w:sz="0" w:val="nil"/>
-          <w:right w:space="0" w:sz="0" w:val="nil"/>
-          <w:between w:space="0" w:sz="0" w:val="nil"/>
-        </w:pBdr>
-        <w:spacing w:after="120" w:lineRule="auto"/>
-        <w:ind w:left="284" w:hanging="218"/>
-        <w:jc w:val="both"/>
-        <w:rPr/>
-      </w:pPr>
-      <w:r>
-        <w:rPr>
-          <w:b w:val="1"/>
-          <w:bCs w:val="1"/>
-          <w:rtl w:val="0"/>
-        </w:rPr>
-        <w:t xml:space="preserve">Aplikace</w:t>
-      </w:r>
-      <w:r>
-        <w:rPr>
-          <w:rtl w:val="0"/>
-        </w:rPr>
-        <w:t xml:space="preserve">: TPEG2-RTM (část 12: Aplikace pro zprávy o silniční dopravě), TPEG2-PTI (část 13: Aplikace pro informace o veřejné dopravě), TPEG2-PKI (část 14: Aplikace pro informace o parkování), TPEG2-TEC (část 15: Aplikace pro vybrané dopravní události), TPEG2-FPI (část 16: Aplikace pro informace o cenách pohonných hmot), TPEG2-SPI (část 17: Aplikace pro informace o rychlostních omezeních), TPEG2-TFP (část 18: Aplikace pro informace o stavu dopravního proudu a jeho predikci), TPEG2-WEA (část 19: Aplikace pro informace o počasí), TPEG2-RMR (část 23: Aplikace pro informace o multimodálních trasách), TPEG2-EMI (část 25: Nabíjecí infrastruktura pro elektromobily) a další.</w:t>
-      </w:r>
-    </w:p>
-    <w:p>
-      <w:pPr>
-        <w:pageBreakBefore w:val="0"/>
-        <w:spacing w:after="120" w:lineRule="auto"/>
-        <w:jc w:val="both"/>
-        <w:rPr/>
-      </w:pPr>
-      <w:r>
-        <w:rPr>
-          <w:rtl w:val="0"/>
-        </w:rPr>
-        <w:t xml:space="preserve">Na rozdíl od RDS-TMC, které je svým způsobem popisu události jednoúrovňové, umožňuje TPEG informace členit strukturovaně se zvyšující se mírou detailu. Dopravní události popisuje TPEG úzkoprofilově, je vždy zaměřen na jeden konkrétní typ situací (například pro ceny pohonných hmot, dojezdové doby atd.), které popisuje do větší hloubky, každému typu je věnována samostatná část specifikace (tzv. ”aplikace TPEG”). </w:t>
-      </w:r>
-    </w:p>
-    <w:p>
-      <w:pPr>
-        <w:pageBreakBefore w:val="0"/>
-        <w:spacing w:after="120" w:lineRule="auto"/>
-        <w:jc w:val="both"/>
-        <w:rPr/>
-      </w:pPr>
-      <w:r>
-        <w:rPr>
-          <w:rtl w:val="0"/>
-        </w:rPr>
-        <w:t xml:space="preserve">Rozlišení TPEG/TPEG1/TPEG2 se většinou uvádí pouze v úvodu částí norem/specifikací, zatímco ostatní kapitoly již mezi TPEG a TPEG2 nerozlišují - to je implicitní dle kontextu. Stejným způsobem k tomu přistupujeme i v tomto extraktu.</w:t>
-      </w:r>
-    </w:p>
-    <w:p>
-      <w:pPr>
-        <w:pageBreakBefore w:val="0"/>
-        <w:spacing w:after="120" w:lineRule="auto"/>
-        <w:jc w:val="both"/>
-        <w:rPr/>
-      </w:pPr>
-      <w:r>
-        <w:rPr>
-          <w:rtl w:val="0"/>
-        </w:rPr>
-        <w:t xml:space="preserve">Tento extrakt popisuje část 10 „Informace o podmíněném přístupu (CAI)” (dále jen “popisovaný dokument”), která specifikuje obálku komponenty CAI a popisuje vhodnost linkování komponent CAI se zašifrovaným obsahem v jiných komponentách služby.</w:t>
+        <w:t xml:space="preserve">Technická specifikace ISO 21219 stanovuje formát a protokol TPEG určený pro poskytování informací o dopravě koncovým uživatelům. TPEG je určen pro média s vysokou přenosovou kapacitou, umožňuje informace členit strukturovaně se zvyšující se mírou detailů a komplexně popisovat polohu.</w:t>
+      </w:r>
+    </w:p>
+    <w:p>
+      <w:pPr>
+        <w:pageBreakBefore w:val="0"/>
+        <w:spacing w:after="120" w:lineRule="auto"/>
+        <w:jc w:val="both"/>
+        <w:rPr/>
+      </w:pPr>
+      <w:r>
+        <w:rPr>
+          <w:rtl w:val="0"/>
+        </w:rPr>
+        <w:t xml:space="preserve">Jednotlivé oblasti dopravních událostí jsou v TPEG popsány odděleně, pomocí platformě nezávislého modelu (UML) a dvou odvozených platformě závislých modelů (binární a XML). Části specifikace stanovují pravidla tvorby modelu jeho převodu do platformě závislé podoby.</w:t>
+      </w:r>
+    </w:p>
+    <w:p>
+      <w:pPr>
+        <w:pageBreakBefore w:val="0"/>
+        <w:spacing w:after="120" w:lineRule="auto"/>
+        <w:jc w:val="both"/>
+        <w:rPr/>
+      </w:pPr>
+      <w:r>
+        <w:rPr>
+          <w:rtl w:val="0"/>
+        </w:rPr>
+        <w:t xml:space="preserve">Více informací o kontextu TPEG je obsaženo v úvodu extraktu k části 1 normy TPEG (21219-1).</w:t>
+      </w:r>
+    </w:p>
+    <w:p>
+      <w:pPr>
+        <w:pageBreakBefore w:val="0"/>
+        <w:spacing w:after="120" w:lineRule="auto"/>
+        <w:jc w:val="both"/>
+        <w:rPr/>
+      </w:pPr>
+      <w:r>
+        <w:rPr>
+          <w:rtl w:val="0"/>
+        </w:rPr>
+        <w:t xml:space="preserve">Technická specifikace ISO 21219 se zabývá druhou generací protokolu TPEG, označovaným zkratkou TPEG2. Rozlišení TPEG/TPEG1/TPEG2 se většinou uvádí pouze v úvodní části norem/specifikací, zatímco ostatní kapitoly již mezi TPEG a TPEG2 nerozlišují - to je implicitní dle kontextu.</w:t>
+      </w:r>
+    </w:p>
+    <w:p>
+      <w:pPr>
+        <w:pageBreakBefore w:val="0"/>
+        <w:spacing w:after="120" w:lineRule="auto"/>
+        <w:jc w:val="both"/>
+        <w:rPr/>
+      </w:pPr>
+      <w:r>
+        <w:rPr>
+          <w:rtl w:val="0"/>
+        </w:rPr>
+        <w:t xml:space="preserve">Tento extrakt (dále jen “popisovaný dokument”) popisuje část 10 normy TPEG, která specifikuje obálku komponenty CAI a popisuje vhodnost linkování komponent CAI se zašifrovaným obsahem v jiných komponentách služby.</w:t>
       </w:r>
     </w:p>
     <w:p>
@@ -727,8 +529,9 @@
           <w:sz w:val="18"/>
           <w:szCs w:val="18"/>
           <w:rtl w:val="0"/>
-        </w:rPr>
-        <w:t xml:space="preserve">Poznámka: Extrakt přejímá původní číslování kapitol.</w:t>
+          <w:i/>
+        </w:rPr>
+        <w:t xml:space="preserve">Poznámka: Extrakt uvádí vybrané kapitoly popisovaného dokumentu a přejímá původní číslování kapitol.</w:t>
       </w:r>
     </w:p>
     <w:p>
@@ -810,7 +613,7 @@
         <w:rPr>
           <w:rtl w:val="0"/>
         </w:rPr>
-        <w:t xml:space="preserve">Klíčové normy, na které tento dokument odkazuje, jsou: specifikace TPEG2 části 1 až 6 a 9. Důležité jsou zejména TPEG2-SNI (část 5) a TPEG2-SWF (část 9).</w:t>
+        <w:t xml:space="preserve">Tento dokument uvádí 7 normativních odkazů na normu TPEG2 ISO 21219 části 1-6 a 9. Důležité jsou zejména TPEG2-SNI (část 5) a TPEG2-SWF (část 9).</w:t>
       </w:r>
     </w:p>
     <w:p>
@@ -1419,11 +1222,15 @@
       </w:pPr>
       <w:r>
         <w:rPr>
-          <w:b w:val="1"/>
-          <w:bCs w:val="1"/>
-          <w:rtl w:val="0"/>
-        </w:rPr>
-        <w:t xml:space="preserve">Obrázek 1 – Struktura zprávy CAI (obr. 1 normy)</w:t>
+          <w:rtl w:val="0"/>
+        </w:rPr>
+        <w:t xml:space="preserve">Obrázek 1 – </w:t>
+      </w:r>
+      <w:r>
+        <w:rPr>
+          <w:rtl w:val="0"/>
+        </w:rPr>
+        <w:t xml:space="preserve">Struktura zprávy CAI (obr. 1 dokumentu)</w:t>
       </w:r>
     </w:p>
     <w:p>
@@ -1477,7 +1284,7 @@
         <w:rPr>
           <w:rtl w:val="0"/>
         </w:rPr>
-        <w:t xml:space="preserve">9 Bibliografie</w:t>
+        <w:t xml:space="preserve">9 Literatura</w:t>
       </w:r>
     </w:p>
     <w:p>

</xml_diff>